<commit_message>
feat(report-templates): WAPT v14 and Network v9
- v13 / v8: the finding table's OWASP Top Ten and iSec Check List rows list
  the checklist items chosen on the finding (${checklistItems <name>}, one
  per line), replacing the single category and the free-text
  isec_checklist_ref field, which is retired.
- v14 / v9: the cover title and the 1.1 Document Title print ${asmtName},
  the assessment name (Client + Target + Assessment Type).

MAPPING, README and AGENT.md document both.

Claude-Session: https://claude.ai/code/session_01Ph5G1wZpmcguhYaiYsuuzz
Signed-off-by: Wasfy Elbaz <wasfylbaz@gmail.com>
</commit_message>
<xml_diff>
--- a/report-templates/templates/network/isec-network-annotated.docx
+++ b/report-templates/templates/network/isec-network-annotated.docx
@@ -518,7 +518,7 @@
                                     <w:szCs w:val="56"/>
                                     <w:lang w:val="en-US"/>
                                   </w:rPr>
-                                  <w:t xml:space="preserve">${asmtClient} ${project_name} ${network_type}</w:t>
+                                  <w:t xml:space="preserve">${asmtName}</w:t>
                                 </w:r>
                                 <w:r>
                                   <w:rPr>
@@ -528,7 +528,7 @@
                                     <w:szCs w:val="56"/>
                                     <w:lang w:val="en-US"/>
                                   </w:rPr>
-                                  <w:t xml:space="preserve"> </w:t>
+                                  <w:t xml:space="preserve"/>
                                 </w:r>
                                 <w:r>
                                   <w:rPr>
@@ -538,7 +538,7 @@
                                     <w:szCs w:val="56"/>
                                     <w:lang w:val="en-US"/>
                                   </w:rPr>
-                                  <w:t>Penetration Testing</w:t>
+                                  <w:t/>
                                 </w:r>
                                 <w:r>
                                   <w:rPr>
@@ -548,7 +548,7 @@
                                     <w:szCs w:val="56"/>
                                     <w:lang w:val="en-US"/>
                                   </w:rPr>
-                                  <w:t xml:space="preserve"> </w:t>
+                                  <w:t xml:space="preserve"/>
                                 </w:r>
                                 <w:r>
                                   <w:rPr>
@@ -558,7 +558,7 @@
                                     <w:szCs w:val="56"/>
                                     <w:lang w:val="en-US"/>
                                   </w:rPr>
-                                  <w:t>Report</w:t>
+                                  <w:t/>
                                 </w:r>
                                 <w:commentRangeEnd w:id="0"/>
                                 <w:r>
@@ -610,7 +610,7 @@
                               <w:szCs w:val="56"/>
                               <w:lang w:val="en-US"/>
                             </w:rPr>
-                            <w:t xml:space="preserve">${asmtClient} ${project_name} ${network_type}</w:t>
+                            <w:t xml:space="preserve">${asmtName}</w:t>
                           </w:r>
                           <w:r>
                             <w:rPr>
@@ -620,7 +620,7 @@
                               <w:szCs w:val="56"/>
                               <w:lang w:val="en-US"/>
                             </w:rPr>
-                            <w:t xml:space="preserve"> </w:t>
+                            <w:t xml:space="preserve"/>
                           </w:r>
                           <w:r>
                             <w:rPr>
@@ -630,7 +630,7 @@
                               <w:szCs w:val="56"/>
                               <w:lang w:val="en-US"/>
                             </w:rPr>
-                            <w:t>Penetration Testing</w:t>
+                            <w:t/>
                           </w:r>
                           <w:r>
                             <w:rPr>
@@ -640,7 +640,7 @@
                               <w:szCs w:val="56"/>
                               <w:lang w:val="en-US"/>
                             </w:rPr>
-                            <w:t xml:space="preserve"> </w:t>
+                            <w:t xml:space="preserve"/>
                           </w:r>
                           <w:r>
                             <w:rPr>
@@ -650,7 +650,7 @@
                               <w:szCs w:val="56"/>
                               <w:lang w:val="en-US"/>
                             </w:rPr>
-                            <w:t>Report</w:t>
+                            <w:t/>
                           </w:r>
                         </w:p>
                       </w:txbxContent>
@@ -4208,22 +4208,22 @@
               <w:rPr>
                 <w:color w:val="000000" w:themeColor="text1"/>
               </w:rPr>
-              <w:t xml:space="preserve">${asmtClient} ${project_name} ${network_type}</w:t>
-            </w:r>
-            <w:r>
-              <w:t xml:space="preserve"> </w:t>
+              <w:t xml:space="preserve">${asmtName}</w:t>
+            </w:r>
+            <w:r>
+              <w:t xml:space="preserve"/>
             </w:r>
             <w:r>
               <w:rPr>
                 <w:color w:val="000000" w:themeColor="text1"/>
               </w:rPr>
-              <w:t xml:space="preserve">Penetration Testing Report </w:t>
+              <w:t xml:space="preserve"/>
             </w:r>
             <w:r>
               <w:rPr>
                 <w:color w:val="000000" w:themeColor="text1"/>
               </w:rPr>
-              <w:t xml:space="preserve">v${report_version}</w:t>
+              <w:t xml:space="preserve"/>
             </w:r>
             <w:proofErr w:type="spellStart"/>
             <w:proofErr w:type="spellEnd"/>
@@ -13476,7 +13476,7 @@
               </w:rPr>
             </w:pPr>
             <w:r>
-              <w:t xml:space="preserve">${isec_checklist_ref}</w:t>
+              <w:t xml:space="preserve">${checklistItems isec-network-penetration-testing-checklist}</w:t>
             </w:r>
           </w:p>
         </w:tc>
@@ -15844,7 +15844,7 @@
         <w:annotationRef/>
       </w:r>
       <w:r>
-        <w:t xml:space="preserve">${fiBegin}...${fiEnd} repeats once per finding, in the assessment's display order: heading ${vulnName} (Word numbering supplies 5.1.N), the table (${severity} with fill FAC701, ${cvssScore} + hyperlink text ${cvssLink View CVSS Metrics}, linked to the NVD calculator for this finding's vector, ${asmt_phase}, ${assetLocation}, ${isec_checklist_ref} STRING vuln UDF, ${desc}, ${impact_narrative} RICH_TEXT vuln UDF, ${rec}), Proof Of Concept = ${details} (steps and screenshots from the editor; ${Figure#.N} captions), then the page break. The ${fill} paragraph is the block's colour map and is removed on generation. Delete nothing inside the block; never put ${noIssuesText} or ${count} in it.</w:t>
+        <w:t xml:space="preserve">${fiBegin}...${fiEnd} repeats once per finding, in the assessment's display order: heading ${vulnName} (Word numbering supplies 5.1.N), the table (${severity} with fill FAC701, ${cvssScore} + hyperlink text ${cvssLink View CVSS Metrics}, linked to the NVD calculator for this finding's vector, ${asmt_phase}, ${assetLocation}, ${checklistItems isec-network-penetration-testing-checklist} (the network checklist items chosen on the finding, one per line; choosing one marks it Vulnerable), ${desc}, ${impact_narrative} RICH_TEXT vuln UDF, ${rec}), Proof Of Concept = ${details} (steps and screenshots from the editor; ${Figure#.N} captions), then the page break. The ${fill} paragraph is the block's colour map and is removed on generation. Delete nothing inside the block; never put ${noIssuesText} or ${count} in it.</w:t>
       </w:r>
     </w:p>
   </w:comment>

</xml_diff>